<commit_message>
Adicionar um metodo getType para perceber que tipo de peça é
</commit_message>
<xml_diff>
--- a/docs/00-modelo_de_relatório_não_obrigatório.docx
+++ b/docs/00-modelo_de_relatório_não_obrigatório.docx
@@ -645,23 +645,10 @@
         <w:t>,</w:t>
       </w:r>
       <w:r>
-        <w:t xml:space="preserve"> </w:t>
-      </w:r>
-      <w:proofErr w:type="gramStart"/>
-      <w:r>
-        <w:t>Julho</w:t>
-      </w:r>
-      <w:proofErr w:type="gramEnd"/>
-      <w:r>
-        <w:t xml:space="preserve"> – </w:t>
-      </w:r>
-      <w:proofErr w:type="gramStart"/>
-      <w:r>
-        <w:t>Setembro</w:t>
-      </w:r>
-      <w:proofErr w:type="gramEnd"/>
-      <w:r>
-        <w:t>; UC</w:t>
+        <w:t xml:space="preserve"> Julho – </w:t>
+      </w:r>
+      <w:r>
+        <w:t>Setembro; UC</w:t>
       </w:r>
       <w:r>
         <w:t>6</w:t>
@@ -957,37 +944,70 @@
         <w:rPr>
           <w:u w:val="single"/>
         </w:rPr>
-        <w:t xml:space="preserve"> - GCC </w:t>
-      </w:r>
-      <w:r>
+        <w:t xml:space="preserve"> - GCC 16.1.0 (MSYS2 UCRT64)</w:t>
+      </w:r>
+    </w:p>
+    <w:p>
+      <w:pPr>
         <w:rPr>
           <w:u w:val="single"/>
         </w:rPr>
-        <w:t>16.1.0</w:t>
-      </w:r>
-      <w:r>
-        <w:rPr>
+      </w:pPr>
+      <w:r>
+        <w:rPr>
+          <w:b/>
+          <w:bCs/>
           <w:u w:val="single"/>
         </w:rPr>
+        <w:t xml:space="preserve">Sistema de </w:t>
+      </w:r>
+      <w:proofErr w:type="spellStart"/>
+      <w:r>
+        <w:rPr>
+          <w:b/>
+          <w:bCs/>
+          <w:u w:val="single"/>
+        </w:rPr>
+        <w:t>build</w:t>
+      </w:r>
+      <w:proofErr w:type="spellEnd"/>
+      <w:r>
+        <w:rPr>
+          <w:u w:val="single"/>
+        </w:rPr>
+        <w:t xml:space="preserve"> - </w:t>
+      </w:r>
+      <w:proofErr w:type="spellStart"/>
+      <w:r>
+        <w:rPr>
+          <w:u w:val="single"/>
+        </w:rPr>
+        <w:t>CMake</w:t>
+      </w:r>
+      <w:proofErr w:type="spellEnd"/>
+      <w:r>
+        <w:rPr>
+          <w:u w:val="single"/>
+        </w:rPr>
         <w:t xml:space="preserve"> (</w:t>
       </w:r>
       <w:r>
+        <w:t>gerador</w:t>
+      </w:r>
+      <w:r>
         <w:rPr>
           <w:u w:val="single"/>
         </w:rPr>
-        <w:t>MSYS2 UCRT64</w:t>
-      </w:r>
-      <w:r>
+        <w:t>: Ninja)</w:t>
+      </w:r>
+    </w:p>
+    <w:p/>
+    <w:p>
+      <w:pPr>
+        <w:pStyle w:val="Ttulo1"/>
         <w:rPr>
           <w:u w:val="single"/>
         </w:rPr>
-        <w:t>)</w:t>
-      </w:r>
-    </w:p>
-    <w:p/>
-    <w:p>
-      <w:pPr>
-        <w:pStyle w:val="Ttulo1"/>
         <w:sectPr>
           <w:pgSz w:w="11907" w:h="16840" w:code="9"/>
           <w:pgMar w:top="1440" w:right="1080" w:bottom="1440" w:left="1080" w:header="142" w:footer="720" w:gutter="0"/>
@@ -2767,15 +2787,21 @@
 </file>
 
 <file path=customXml/item1.xml><?xml version="1.0" encoding="utf-8"?>
-<?mso-contentType ?>
-<FormTemplates xmlns="http://schemas.microsoft.com/sharepoint/v3/contenttype/forms">
-  <Display>DocumentLibraryForm</Display>
-  <Edit>DocumentLibraryForm</Edit>
-  <New>DocumentLibraryForm</New>
-</FormTemplates>
+<b:Sources xmlns:b="http://schemas.openxmlformats.org/officeDocument/2006/bibliography" xmlns="http://schemas.openxmlformats.org/officeDocument/2006/bibliography" SelectedStyle="\APASixthEditionOfficeOnline.xsl" StyleName="APA" Version="6"/>
 </file>
 
 <file path=customXml/item2.xml><?xml version="1.0" encoding="utf-8"?>
+<p:properties xmlns:p="http://schemas.microsoft.com/office/2006/metadata/properties" xmlns:xsi="http://www.w3.org/2001/XMLSchema-instance" xmlns:pc="http://schemas.microsoft.com/office/infopath/2007/PartnerControls">
+  <documentManagement>
+    <lcf76f155ced4ddcb4097134ff3c332f xmlns="c5c33c99-d79f-4d59-b992-29971c3bc0d8">
+      <Terms xmlns="http://schemas.microsoft.com/office/infopath/2007/PartnerControls"/>
+    </lcf76f155ced4ddcb4097134ff3c332f>
+    <TaxCatchAll xmlns="985cf034-2dc9-4896-a0ec-6723158eb886" xsi:nil="true"/>
+  </documentManagement>
+</p:properties>
+</file>
+
+<file path=customXml/item3.xml><?xml version="1.0" encoding="utf-8"?>
 <ct:contentTypeSchema xmlns:ct="http://schemas.microsoft.com/office/2006/metadata/contentType" xmlns:ma="http://schemas.microsoft.com/office/2006/metadata/properties/metaAttributes" ct:_="" ma:_="" ma:contentTypeName="Documento" ma:contentTypeID="0x010100A24D321C9C560546891261CD71B05A75" ma:contentTypeVersion="11" ma:contentTypeDescription="Criar um novo documento." ma:contentTypeScope="" ma:versionID="a765520f07c05583df008b7168a655db">
   <xsd:schema xmlns:xsd="http://www.w3.org/2001/XMLSchema" xmlns:xs="http://www.w3.org/2001/XMLSchema" xmlns:p="http://schemas.microsoft.com/office/2006/metadata/properties" xmlns:ns2="c5c33c99-d79f-4d59-b992-29971c3bc0d8" xmlns:ns3="985cf034-2dc9-4896-a0ec-6723158eb886" targetNamespace="http://schemas.microsoft.com/office/2006/metadata/properties" ma:root="true" ma:fieldsID="5d7ffd71e4adc7bca2baad4441203202" ns2:_="" ns3:_="">
     <xsd:import namespace="c5c33c99-d79f-4d59-b992-29971c3bc0d8"/>
@@ -2970,30 +2996,35 @@
 </ct:contentTypeSchema>
 </file>
 
-<file path=customXml/item3.xml><?xml version="1.0" encoding="utf-8"?>
-<p:properties xmlns:p="http://schemas.microsoft.com/office/2006/metadata/properties" xmlns:xsi="http://www.w3.org/2001/XMLSchema-instance" xmlns:pc="http://schemas.microsoft.com/office/infopath/2007/PartnerControls">
-  <documentManagement>
-    <lcf76f155ced4ddcb4097134ff3c332f xmlns="c5c33c99-d79f-4d59-b992-29971c3bc0d8">
-      <Terms xmlns="http://schemas.microsoft.com/office/infopath/2007/PartnerControls"/>
-    </lcf76f155ced4ddcb4097134ff3c332f>
-    <TaxCatchAll xmlns="985cf034-2dc9-4896-a0ec-6723158eb886" xsi:nil="true"/>
-  </documentManagement>
-</p:properties>
-</file>
-
 <file path=customXml/item4.xml><?xml version="1.0" encoding="utf-8"?>
-<b:Sources xmlns:b="http://schemas.openxmlformats.org/officeDocument/2006/bibliography" xmlns="http://schemas.openxmlformats.org/officeDocument/2006/bibliography" SelectedStyle="\APASixthEditionOfficeOnline.xsl" StyleName="APA" Version="6"/>
+<?mso-contentType ?>
+<FormTemplates xmlns="http://schemas.microsoft.com/sharepoint/v3/contenttype/forms">
+  <Display>DocumentLibraryForm</Display>
+  <Edit>DocumentLibraryForm</Edit>
+  <New>DocumentLibraryForm</New>
+</FormTemplates>
 </file>
 
 <file path=customXml/itemProps1.xml><?xml version="1.0" encoding="utf-8"?>
-<ds:datastoreItem xmlns:ds="http://schemas.openxmlformats.org/officeDocument/2006/customXml" ds:itemID="{9E05DD0C-03F6-4276-8075-885FC7263C13}">
+<ds:datastoreItem xmlns:ds="http://schemas.openxmlformats.org/officeDocument/2006/customXml" ds:itemID="{9DDECE79-5648-45ED-AAED-A92AACACC313}">
   <ds:schemaRefs>
-    <ds:schemaRef ds:uri="http://schemas.microsoft.com/sharepoint/v3/contenttype/forms"/>
+    <ds:schemaRef ds:uri="http://schemas.openxmlformats.org/officeDocument/2006/bibliography"/>
   </ds:schemaRefs>
 </ds:datastoreItem>
 </file>
 
 <file path=customXml/itemProps2.xml><?xml version="1.0" encoding="utf-8"?>
+<ds:datastoreItem xmlns:ds="http://schemas.openxmlformats.org/officeDocument/2006/customXml" ds:itemID="{57834C8E-2454-4C0B-BCC6-25E0BE841C2E}">
+  <ds:schemaRefs>
+    <ds:schemaRef ds:uri="http://schemas.microsoft.com/office/2006/metadata/properties"/>
+    <ds:schemaRef ds:uri="http://schemas.microsoft.com/office/infopath/2007/PartnerControls"/>
+    <ds:schemaRef ds:uri="c5c33c99-d79f-4d59-b992-29971c3bc0d8"/>
+    <ds:schemaRef ds:uri="985cf034-2dc9-4896-a0ec-6723158eb886"/>
+  </ds:schemaRefs>
+</ds:datastoreItem>
+</file>
+
+<file path=customXml/itemProps3.xml><?xml version="1.0" encoding="utf-8"?>
 <ds:datastoreItem xmlns:ds="http://schemas.openxmlformats.org/officeDocument/2006/customXml" ds:itemID="{E9E5750F-097D-4959-B9DC-8755F7E80525}">
   <ds:schemaRefs>
     <ds:schemaRef ds:uri="http://schemas.microsoft.com/office/2006/metadata/contentType"/>
@@ -3012,21 +3043,10 @@
 </ds:datastoreItem>
 </file>
 
-<file path=customXml/itemProps3.xml><?xml version="1.0" encoding="utf-8"?>
-<ds:datastoreItem xmlns:ds="http://schemas.openxmlformats.org/officeDocument/2006/customXml" ds:itemID="{57834C8E-2454-4C0B-BCC6-25E0BE841C2E}">
+<file path=customXml/itemProps4.xml><?xml version="1.0" encoding="utf-8"?>
+<ds:datastoreItem xmlns:ds="http://schemas.openxmlformats.org/officeDocument/2006/customXml" ds:itemID="{9E05DD0C-03F6-4276-8075-885FC7263C13}">
   <ds:schemaRefs>
-    <ds:schemaRef ds:uri="http://schemas.microsoft.com/office/2006/metadata/properties"/>
-    <ds:schemaRef ds:uri="http://schemas.microsoft.com/office/infopath/2007/PartnerControls"/>
-    <ds:schemaRef ds:uri="c5c33c99-d79f-4d59-b992-29971c3bc0d8"/>
-    <ds:schemaRef ds:uri="985cf034-2dc9-4896-a0ec-6723158eb886"/>
-  </ds:schemaRefs>
-</ds:datastoreItem>
-</file>
-
-<file path=customXml/itemProps4.xml><?xml version="1.0" encoding="utf-8"?>
-<ds:datastoreItem xmlns:ds="http://schemas.openxmlformats.org/officeDocument/2006/customXml" ds:itemID="{9DDECE79-5648-45ED-AAED-A92AACACC313}">
-  <ds:schemaRefs>
-    <ds:schemaRef ds:uri="http://schemas.openxmlformats.org/officeDocument/2006/bibliography"/>
+    <ds:schemaRef ds:uri="http://schemas.microsoft.com/sharepoint/v3/contenttype/forms"/>
   </ds:schemaRefs>
 </ds:datastoreItem>
 </file>

</xml_diff>